<commit_message>
Adding updated timestamp doc
</commit_message>
<xml_diff>
--- a/Development_Session_Log.docx
+++ b/Development_Session_Log.docx
@@ -58,126 +58,75 @@
           <w:sz w:val="22"/>
           <w:szCs w:val="22"/>
         </w:rPr>
-        <w:t xml:space="preserve">Initial project setup: created the raylib 2D template in C, configured it for Visual Studio, and resolved the build errors encountered while getting the toolchain working.</w:t>
-      </w:r>
-    </w:p>
-    <w:p>
-      <w:pPr>
-        <w:pStyle w:val="ListParagraph"/>
-        <w:numPr>
-          <w:ilvl w:val="0"/>
-          <w:numId w:val="1"/>
-        </w:numPr>
-        <w:spacing w:after="80"/>
-      </w:pPr>
-      <w:r>
-        <w:rPr>
-          <w:sz w:val="22"/>
-          <w:szCs w:val="22"/>
-        </w:rPr>
-        <w:t xml:space="preserve">Created the initial raylib 2D project template: a Visual Studio solution/project (.sln / .vcxproj) plus a main.c with a basic window, game loop, and a controllable square (arrow-key movement).</w:t>
-      </w:r>
-    </w:p>
-    <w:p>
-      <w:pPr>
-        <w:pStyle w:val="ListParagraph"/>
-        <w:numPr>
-          <w:ilvl w:val="0"/>
-          <w:numId w:val="1"/>
-        </w:numPr>
-        <w:spacing w:after="80"/>
-      </w:pPr>
-      <w:r>
-        <w:rPr>
-          <w:sz w:val="22"/>
-          <w:szCs w:val="22"/>
-        </w:rPr>
-        <w:t xml:space="preserve">Fixed MSB8020 (v143 build tools not found) by installing the "MSVC v143 - VS 2022 C++ x64/x86 build tools" component via Visual Studio Installer.</w:t>
-      </w:r>
-    </w:p>
-    <w:p>
-      <w:pPr>
-        <w:pStyle w:val="ListParagraph"/>
-        <w:numPr>
-          <w:ilvl w:val="0"/>
-          <w:numId w:val="1"/>
-        </w:numPr>
-        <w:spacing w:after="80"/>
-      </w:pPr>
-      <w:r>
-        <w:rPr>
-          <w:sz w:val="22"/>
-          <w:szCs w:val="22"/>
-        </w:rPr>
-        <w:t xml:space="preserve">Fixed an invalid &lt;LanguageStandard_C&gt; value ("stdc99" is not a valid MSVC option) by switching to stdc17.</w:t>
-      </w:r>
-    </w:p>
-    <w:p>
-      <w:pPr>
-        <w:pStyle w:val="ListParagraph"/>
-        <w:numPr>
-          <w:ilvl w:val="0"/>
-          <w:numId w:val="1"/>
-        </w:numPr>
-        <w:spacing w:after="80"/>
-      </w:pPr>
-      <w:r>
-        <w:rPr>
-          <w:sz w:val="22"/>
-          <w:szCs w:val="22"/>
-        </w:rPr>
-        <w:t xml:space="preserve">Fixed LNK1104 (cannot open raylib.lib) - traced to raylib being installed as source only; resolved by downloading the prebuilt raylib-5.x_win64_msvc16 release and placing raylib.lib alongside raylib.h.</w:t>
-      </w:r>
-    </w:p>
-    <w:p>
-      <w:pPr>
-        <w:pStyle w:val="ListParagraph"/>
-        <w:numPr>
-          <w:ilvl w:val="0"/>
-          <w:numId w:val="1"/>
-        </w:numPr>
-        <w:spacing w:after="80"/>
-      </w:pPr>
-      <w:r>
-        <w:rPr>
-          <w:sz w:val="22"/>
-          <w:szCs w:val="22"/>
-        </w:rPr>
-        <w:t xml:space="preserve">Added the player_walk.png spritesheet (6 frames, 32x32 each) and implemented spritesheet-based walk animation with DrawTexturePro, including horizontal flipping for left/right facing.</w:t>
-      </w:r>
-    </w:p>
-    <w:p>
-      <w:pPr>
-        <w:pStyle w:val="ListParagraph"/>
-        <w:numPr>
-          <w:ilvl w:val="0"/>
-          <w:numId w:val="1"/>
-        </w:numPr>
-        <w:spacing w:after="80"/>
-      </w:pPr>
-      <w:r>
-        <w:rPr>
-          <w:sz w:val="22"/>
-          <w:szCs w:val="22"/>
-        </w:rPr>
-        <w:t xml:space="preserve">Increased the window resolution from the original 800x450 to 1280x720.</w:t>
-      </w:r>
-    </w:p>
-    <w:p>
-      <w:pPr>
-        <w:pStyle w:val="ListParagraph"/>
-        <w:numPr>
-          <w:ilvl w:val="0"/>
-          <w:numId w:val="1"/>
-        </w:numPr>
-        <w:spacing w:after="80"/>
-      </w:pPr>
-      <w:r>
-        <w:rPr>
-          <w:sz w:val="22"/>
-          <w:szCs w:val="22"/>
-        </w:rPr>
-        <w:t xml:space="preserve">Added a full-screen background image (game_background_1.png, 3840x2160, scaled to fill the window) and constrained the player to a walkable "ground line" so it cannot walk into the tree-canopy art.</w:t>
+        <w:t xml:space="preserve">Set up the raylib 2D template in Visual Studio and got the player moving and animated.</w:t>
+      </w:r>
+    </w:p>
+    <w:p>
+      <w:pPr>
+        <w:pStyle w:val="ListParagraph"/>
+        <w:numPr>
+          <w:ilvl w:val="0"/>
+          <w:numId w:val="1"/>
+        </w:numPr>
+        <w:spacing w:after="80"/>
+      </w:pPr>
+      <w:r>
+        <w:rPr>
+          <w:sz w:val="22"/>
+          <w:szCs w:val="22"/>
+        </w:rPr>
+        <w:t xml:space="preserve">Created the initial project: window, game loop, movable square.</w:t>
+      </w:r>
+    </w:p>
+    <w:p>
+      <w:pPr>
+        <w:pStyle w:val="ListParagraph"/>
+        <w:numPr>
+          <w:ilvl w:val="0"/>
+          <w:numId w:val="1"/>
+        </w:numPr>
+        <w:spacing w:after="80"/>
+      </w:pPr>
+      <w:r>
+        <w:rPr>
+          <w:sz w:val="22"/>
+          <w:szCs w:val="22"/>
+        </w:rPr>
+        <w:t xml:space="preserve">Fixed three build errors: missing v143 build tools, an invalid C language standard setting, and a missing raylib.lib.</w:t>
+      </w:r>
+    </w:p>
+    <w:p>
+      <w:pPr>
+        <w:pStyle w:val="ListParagraph"/>
+        <w:numPr>
+          <w:ilvl w:val="0"/>
+          <w:numId w:val="1"/>
+        </w:numPr>
+        <w:spacing w:after="80"/>
+      </w:pPr>
+      <w:r>
+        <w:rPr>
+          <w:sz w:val="22"/>
+          <w:szCs w:val="22"/>
+        </w:rPr>
+        <w:t xml:space="preserve">Added the player walk animation and increased the window to 1280x720.</w:t>
+      </w:r>
+    </w:p>
+    <w:p>
+      <w:pPr>
+        <w:pStyle w:val="ListParagraph"/>
+        <w:numPr>
+          <w:ilvl w:val="0"/>
+          <w:numId w:val="1"/>
+        </w:numPr>
+        <w:spacing w:after="80"/>
+      </w:pPr>
+      <w:r>
+        <w:rPr>
+          <w:sz w:val="22"/>
+          <w:szCs w:val="22"/>
+        </w:rPr>
+        <w:t xml:space="preserve">Added a background image and kept the player within a walkable ground area.</w:t>
       </w:r>
     </w:p>
     <w:p>
@@ -392,143 +341,92 @@
           <w:sz w:val="22"/>
           <w:szCs w:val="22"/>
         </w:rPr>
-        <w:t xml:space="preserve">Expanded the player from a single walk animation into a full animation state machine (idle, walk, attack, hurt, death), and fixed two bugs that surfaced once multiple animations with different frame counts were introduced.</w:t>
-      </w:r>
-    </w:p>
-    <w:p>
-      <w:pPr>
-        <w:pStyle w:val="ListParagraph"/>
-        <w:numPr>
-          <w:ilvl w:val="0"/>
-          <w:numId w:val="1"/>
-        </w:numPr>
-        <w:spacing w:after="80"/>
-      </w:pPr>
-      <w:r>
-        <w:rPr>
-          <w:sz w:val="22"/>
-          <w:szCs w:val="22"/>
-        </w:rPr>
-        <w:t xml:space="preserve">Added four new spritesheets (player_idle.png, player_attack.png, player_hurt.png, player_death.png - 4/4/4/8 frames respectively) and organized all art assets into a resources/ folder.</w:t>
-      </w:r>
-    </w:p>
-    <w:p>
-      <w:pPr>
-        <w:pStyle w:val="ListParagraph"/>
-        <w:numPr>
-          <w:ilvl w:val="0"/>
-          <w:numId w:val="1"/>
-        </w:numPr>
-        <w:spacing w:after="80"/>
-      </w:pPr>
-      <w:r>
-        <w:rPr>
-          <w:sz w:val="22"/>
-          <w:szCs w:val="22"/>
-        </w:rPr>
-        <w:t xml:space="preserve">Implemented a PlayerState enum (IDLE, WALK, ATTACK, HURT, DEATH) with a switch statement selecting the correct texture and frame count each frame.</w:t>
-      </w:r>
-    </w:p>
-    <w:p>
-      <w:pPr>
-        <w:pStyle w:val="ListParagraph"/>
-        <w:numPr>
-          <w:ilvl w:val="0"/>
-          <w:numId w:val="1"/>
-        </w:numPr>
-        <w:spacing w:after="80"/>
-      </w:pPr>
-      <w:r>
-        <w:rPr>
-          <w:sz w:val="22"/>
-          <w:szCs w:val="22"/>
-        </w:rPr>
-        <w:t xml:space="preserve">Added debug keys to preview each animation independent of gameplay: E = attack, Y = hurt, T = death.</w:t>
-      </w:r>
-    </w:p>
-    <w:p>
-      <w:pPr>
-        <w:pStyle w:val="ListParagraph"/>
-        <w:numPr>
-          <w:ilvl w:val="0"/>
-          <w:numId w:val="1"/>
-        </w:numPr>
-        <w:spacing w:after="80"/>
-      </w:pPr>
-      <w:r>
-        <w:rPr>
-          <w:sz w:val="22"/>
-          <w:szCs w:val="22"/>
-        </w:rPr>
-        <w:t xml:space="preserve">Made attack/hurt/death "one-shot" animations that play through once and stop, instead of looping like idle/walk.</w:t>
-      </w:r>
-    </w:p>
-    <w:p>
-      <w:pPr>
-        <w:pStyle w:val="ListParagraph"/>
-        <w:numPr>
-          <w:ilvl w:val="0"/>
-          <w:numId w:val="1"/>
-        </w:numPr>
-        <w:spacing w:after="80"/>
-      </w:pPr>
-      <w:r>
-        <w:rPr>
-          <w:sz w:val="22"/>
-          <w:szCs w:val="22"/>
-        </w:rPr>
-        <w:t xml:space="preserve">Fixed an invisible-player bug: currentFrame was not reset to 0 when switching state, so after Death (8 frames) finished, currentFrame could be left at a value like 7 - out of range for the idle texture (4 frames) - causing DrawTexturePro to sample outside the loaded image. Fixed by always resetting currentFrame to 0 at the moment state changes.</w:t>
-      </w:r>
-    </w:p>
-    <w:p>
-      <w:pPr>
-        <w:pStyle w:val="ListParagraph"/>
-        <w:numPr>
-          <w:ilvl w:val="0"/>
-          <w:numId w:val="1"/>
-        </w:numPr>
-        <w:spacing w:after="80"/>
-      </w:pPr>
-      <w:r>
-        <w:rPr>
-          <w:sz w:val="22"/>
-          <w:szCs w:val="22"/>
-        </w:rPr>
-        <w:t xml:space="preserve">Fixed an animation-spam bug: rapidly pressing E/Y/T could interrupt an animation mid-playback and restart it, producing broken/glitchy animation. Fixed by gating all three debug key checks behind a "busy" flag that ignores new triggers until the current animation finishes.</w:t>
-      </w:r>
-    </w:p>
-    <w:p>
-      <w:pPr>
-        <w:pStyle w:val="ListParagraph"/>
-        <w:numPr>
-          <w:ilvl w:val="0"/>
-          <w:numId w:val="1"/>
-        </w:numPr>
-        <w:spacing w:after="80"/>
-      </w:pPr>
-      <w:r>
-        <w:rPr>
-          <w:sz w:val="22"/>
-          <w:szCs w:val="22"/>
-        </w:rPr>
-        <w:t xml:space="preserve">Added a 1-second hold timer so the death animation pauses on its final frame instead of resetting instantly, then automatically returns the player to idle once the hold completes.</w:t>
-      </w:r>
-    </w:p>
-    <w:p>
-      <w:pPr>
-        <w:pStyle w:val="ListParagraph"/>
-        <w:numPr>
-          <w:ilvl w:val="0"/>
-          <w:numId w:val="1"/>
-        </w:numPr>
-        <w:spacing w:after="80"/>
-      </w:pPr>
-      <w:r>
-        <w:rPr>
-          <w:sz w:val="22"/>
-          <w:szCs w:val="22"/>
-        </w:rPr>
-        <w:t xml:space="preserve">Added a black background box behind the on-screen debug instructions text for readability against the background art.</w:t>
+        <w:t xml:space="preserve">Added the full animation state machine: idle, walk, attack, hurt, and death.</w:t>
+      </w:r>
+    </w:p>
+    <w:p>
+      <w:pPr>
+        <w:pStyle w:val="ListParagraph"/>
+        <w:numPr>
+          <w:ilvl w:val="0"/>
+          <w:numId w:val="1"/>
+        </w:numPr>
+        <w:spacing w:after="80"/>
+      </w:pPr>
+      <w:r>
+        <w:rPr>
+          <w:sz w:val="22"/>
+          <w:szCs w:val="22"/>
+        </w:rPr>
+        <w:t xml:space="preserve">Added idle/attack/hurt/death spritesheets and a resources/ folder.</w:t>
+      </w:r>
+    </w:p>
+    <w:p>
+      <w:pPr>
+        <w:pStyle w:val="ListParagraph"/>
+        <w:numPr>
+          <w:ilvl w:val="0"/>
+          <w:numId w:val="1"/>
+        </w:numPr>
+        <w:spacing w:after="80"/>
+      </w:pPr>
+      <w:r>
+        <w:rPr>
+          <w:sz w:val="22"/>
+          <w:szCs w:val="22"/>
+        </w:rPr>
+        <w:t xml:space="preserve">Added debug keys to preview each animation: E, Y, T.</w:t>
+      </w:r>
+    </w:p>
+    <w:p>
+      <w:pPr>
+        <w:pStyle w:val="ListParagraph"/>
+        <w:numPr>
+          <w:ilvl w:val="0"/>
+          <w:numId w:val="1"/>
+        </w:numPr>
+        <w:spacing w:after="80"/>
+      </w:pPr>
+      <w:r>
+        <w:rPr>
+          <w:sz w:val="22"/>
+          <w:szCs w:val="22"/>
+        </w:rPr>
+        <w:t xml:space="preserve">Fixed an invisible-player bug caused by a leftover frame index from a longer animation.</w:t>
+      </w:r>
+    </w:p>
+    <w:p>
+      <w:pPr>
+        <w:pStyle w:val="ListParagraph"/>
+        <w:numPr>
+          <w:ilvl w:val="0"/>
+          <w:numId w:val="1"/>
+        </w:numPr>
+        <w:spacing w:after="80"/>
+      </w:pPr>
+      <w:r>
+        <w:rPr>
+          <w:sz w:val="22"/>
+          <w:szCs w:val="22"/>
+        </w:rPr>
+        <w:t xml:space="preserve">Fixed animations breaking when the trigger key was spammed mid-play.</w:t>
+      </w:r>
+    </w:p>
+    <w:p>
+      <w:pPr>
+        <w:pStyle w:val="ListParagraph"/>
+        <w:numPr>
+          <w:ilvl w:val="0"/>
+          <w:numId w:val="1"/>
+        </w:numPr>
+        <w:spacing w:after="80"/>
+      </w:pPr>
+      <w:r>
+        <w:rPr>
+          <w:sz w:val="22"/>
+          <w:szCs w:val="22"/>
+        </w:rPr>
+        <w:t xml:space="preserve">Death now holds on its last frame for a second before resetting.</w:t>
       </w:r>
     </w:p>
     <w:p>
@@ -681,75 +579,160 @@
           <w:sz w:val="22"/>
           <w:szCs w:val="22"/>
         </w:rPr>
-        <w:t xml:space="preserve">Documentation session: produced learning material explaining the raylib concepts used in the project, in two formats, for course submission.</w:t>
-      </w:r>
-    </w:p>
-    <w:p>
-      <w:pPr>
-        <w:pStyle w:val="ListParagraph"/>
-        <w:numPr>
-          <w:ilvl w:val="0"/>
-          <w:numId w:val="1"/>
-        </w:numPr>
-        <w:spacing w:after="80"/>
-      </w:pPr>
-      <w:r>
-        <w:rPr>
-          <w:sz w:val="22"/>
-          <w:szCs w:val="22"/>
-        </w:rPr>
-        <w:t xml:space="preserve">Wrote a general raylib basics tutorial (not a project walkthrough) covering thirteen core topics: the window/game loop, delta time, keyboard/mouse input, drawing shapes, colors, texture loading, DrawTexturePro (cropping/scaling/flipping), spritesheet animation, multi-animation state switching, simple collision/bounds checking, timers, and debug helpers - each backed by a short standalone code example, with several examples cross-referenced against the real code in main.c.</w:t>
-      </w:r>
-    </w:p>
-    <w:p>
-      <w:pPr>
-        <w:pStyle w:val="ListParagraph"/>
-        <w:numPr>
-          <w:ilvl w:val="0"/>
-          <w:numId w:val="1"/>
-        </w:numPr>
-        <w:spacing w:after="80"/>
-      </w:pPr>
-      <w:r>
-        <w:rPr>
-          <w:sz w:val="22"/>
-          <w:szCs w:val="22"/>
-        </w:rPr>
-        <w:t xml:space="preserve">Delivered the tutorial as a formatted Word document (.docx) with a shaded/bordered code style and a function quick-reference table.</w:t>
-      </w:r>
-    </w:p>
-    <w:p>
-      <w:pPr>
-        <w:pStyle w:val="ListParagraph"/>
-        <w:numPr>
-          <w:ilvl w:val="0"/>
-          <w:numId w:val="1"/>
-        </w:numPr>
-        <w:spacing w:after="80"/>
-      </w:pPr>
-      <w:r>
-        <w:rPr>
-          <w:sz w:val="22"/>
-          <w:szCs w:val="22"/>
-        </w:rPr>
-        <w:t xml:space="preserve">Delivered a second, equivalent version as a Markdown README (TUTORIAL.md) with a linked table of contents, suitable for direct inclusion in the GitHub repository.</w:t>
-      </w:r>
-    </w:p>
-    <w:p>
-      <w:pPr>
-        <w:pStyle w:val="ListParagraph"/>
-        <w:numPr>
-          <w:ilvl w:val="0"/>
-          <w:numId w:val="1"/>
-        </w:numPr>
-        <w:spacing w:after="80"/>
-      </w:pPr>
-      <w:r>
-        <w:rPr>
-          <w:sz w:val="22"/>
-          <w:szCs w:val="22"/>
-        </w:rPr>
-        <w:t xml:space="preserve">Compiled this development session log, cross-referencing the git commit history with the work discussed across all three sessions.</w:t>
+        <w:t xml:space="preserve">Added rock throw, a full enemy with AI and combat, restructured the project into include/src, fixed hitbox sizing and enemy attack range, wrote the tutorial docs, and cleaned up the repo.</w:t>
+      </w:r>
+    </w:p>
+    <w:p>
+      <w:pPr>
+        <w:pStyle w:val="ListParagraph"/>
+        <w:numPr>
+          <w:ilvl w:val="0"/>
+          <w:numId w:val="1"/>
+        </w:numPr>
+        <w:spacing w:after="80"/>
+      </w:pPr>
+      <w:r>
+        <w:rPr>
+          <w:sz w:val="22"/>
+          <w:szCs w:val="22"/>
+        </w:rPr>
+        <w:t xml:space="preserve">Wrote a raylib basics tutorial (Word doc + Markdown README), separate from the project itself.</w:t>
+      </w:r>
+    </w:p>
+    <w:p>
+      <w:pPr>
+        <w:pStyle w:val="ListParagraph"/>
+        <w:numPr>
+          <w:ilvl w:val="0"/>
+          <w:numId w:val="1"/>
+        </w:numPr>
+        <w:spacing w:after="80"/>
+      </w:pPr>
+      <w:r>
+        <w:rPr>
+          <w:sz w:val="22"/>
+          <w:szCs w:val="22"/>
+        </w:rPr>
+        <w:t xml:space="preserve">Added rock throw: hold right-click to aim, release to throw.</w:t>
+      </w:r>
+    </w:p>
+    <w:p>
+      <w:pPr>
+        <w:pStyle w:val="ListParagraph"/>
+        <w:numPr>
+          <w:ilvl w:val="0"/>
+          <w:numId w:val="1"/>
+        </w:numPr>
+        <w:spacing w:after="80"/>
+      </w:pPr>
+      <w:r>
+        <w:rPr>
+          <w:sz w:val="22"/>
+          <w:szCs w:val="22"/>
+        </w:rPr>
+        <w:t xml:space="preserve">Switched movement to WASD and attack to left-click.</w:t>
+      </w:r>
+    </w:p>
+    <w:p>
+      <w:pPr>
+        <w:pStyle w:val="ListParagraph"/>
+        <w:numPr>
+          <w:ilvl w:val="0"/>
+          <w:numId w:val="1"/>
+        </w:numPr>
+        <w:spacing w:after="80"/>
+      </w:pPr>
+      <w:r>
+        <w:rPr>
+          <w:sz w:val="22"/>
+          <w:szCs w:val="22"/>
+        </w:rPr>
+        <w:t xml:space="preserve">Added an enemy: chases the player, attacks in range, 50 HP, respawns after dying.</w:t>
+      </w:r>
+    </w:p>
+    <w:p>
+      <w:pPr>
+        <w:pStyle w:val="ListParagraph"/>
+        <w:numPr>
+          <w:ilvl w:val="0"/>
+          <w:numId w:val="1"/>
+        </w:numPr>
+        <w:spacing w:after="80"/>
+      </w:pPr>
+      <w:r>
+        <w:rPr>
+          <w:sz w:val="22"/>
+          <w:szCs w:val="22"/>
+        </w:rPr>
+        <w:t xml:space="preserve">Added a player health bar.</w:t>
+      </w:r>
+    </w:p>
+    <w:p>
+      <w:pPr>
+        <w:pStyle w:val="ListParagraph"/>
+        <w:numPr>
+          <w:ilvl w:val="0"/>
+          <w:numId w:val="1"/>
+        </w:numPr>
+        <w:spacing w:after="80"/>
+      </w:pPr>
+      <w:r>
+        <w:rPr>
+          <w:sz w:val="22"/>
+          <w:szCs w:val="22"/>
+        </w:rPr>
+        <w:t xml:space="preserve">Restructured the project into include/ and src/ folders.</w:t>
+      </w:r>
+    </w:p>
+    <w:p>
+      <w:pPr>
+        <w:pStyle w:val="ListParagraph"/>
+        <w:numPr>
+          <w:ilvl w:val="0"/>
+          <w:numId w:val="1"/>
+        </w:numPr>
+        <w:spacing w:after="80"/>
+      </w:pPr>
+      <w:r>
+        <w:rPr>
+          <w:sz w:val="22"/>
+          <w:szCs w:val="22"/>
+        </w:rPr>
+        <w:t xml:space="preserve">Fixed hitboxes - they were sized to the full sprite instead of the visible character.</w:t>
+      </w:r>
+    </w:p>
+    <w:p>
+      <w:pPr>
+        <w:pStyle w:val="ListParagraph"/>
+        <w:numPr>
+          <w:ilvl w:val="0"/>
+          <w:numId w:val="1"/>
+        </w:numPr>
+        <w:spacing w:after="80"/>
+      </w:pPr>
+      <w:r>
+        <w:rPr>
+          <w:sz w:val="22"/>
+          <w:szCs w:val="22"/>
+        </w:rPr>
+        <w:t xml:space="preserve">Fixed the enemy attacking from too far away, and attacking while stunned.</w:t>
+      </w:r>
+    </w:p>
+    <w:p>
+      <w:pPr>
+        <w:pStyle w:val="ListParagraph"/>
+        <w:numPr>
+          <w:ilvl w:val="0"/>
+          <w:numId w:val="1"/>
+        </w:numPr>
+        <w:spacing w:after="80"/>
+      </w:pPr>
+      <w:r>
+        <w:rPr>
+          <w:sz w:val="22"/>
+          <w:szCs w:val="22"/>
+        </w:rPr>
+        <w:t xml:space="preserve">Added a .gitignore and removed build/IDE files that were already tracked.</w:t>
       </w:r>
     </w:p>
     <w:p>
@@ -813,6 +796,99 @@
           </w:p>
         </w:tc>
       </w:tr>
+      <w:tr>
+        <w:tc>
+          <w:tcPr>
+            <w:tcW w:type="dxa" w:w="1600"/>
+          </w:tcPr>
+          <w:p>
+            <w:r>
+              <w:rPr>
+                <w:rFonts w:ascii="Consolas" w:cs="Consolas" w:eastAsia="Consolas" w:hAnsi="Consolas"/>
+                <w:sz w:val="18"/>
+                <w:szCs w:val="18"/>
+              </w:rPr>
+              <w:t xml:space="preserve">028cd51</w:t>
+            </w:r>
+          </w:p>
+        </w:tc>
+        <w:tc>
+          <w:tcPr>
+            <w:tcW w:type="dxa" w:w="7000"/>
+          </w:tcPr>
+          <w:p>
+            <w:r>
+              <w:rPr>
+                <w:sz w:val="20"/>
+                <w:szCs w:val="20"/>
+              </w:rPr>
+              <w:t xml:space="preserve">Add hold-to-aim rock throw, switch to WASD movement and left-click attack</w:t>
+            </w:r>
+          </w:p>
+        </w:tc>
+      </w:tr>
+      <w:tr>
+        <w:tc>
+          <w:tcPr>
+            <w:tcW w:type="dxa" w:w="1600"/>
+          </w:tcPr>
+          <w:p>
+            <w:r>
+              <w:rPr>
+                <w:rFonts w:ascii="Consolas" w:cs="Consolas" w:eastAsia="Consolas" w:hAnsi="Consolas"/>
+                <w:sz w:val="18"/>
+                <w:szCs w:val="18"/>
+              </w:rPr>
+              <w:t xml:space="preserve">989db8f</w:t>
+            </w:r>
+          </w:p>
+        </w:tc>
+        <w:tc>
+          <w:tcPr>
+            <w:tcW w:type="dxa" w:w="7000"/>
+          </w:tcPr>
+          <w:p>
+            <w:r>
+              <w:rPr>
+                <w:sz w:val="20"/>
+                <w:szCs w:val="20"/>
+              </w:rPr>
+              <w:t xml:space="preserve">Fix enemy attack range and stop it attacking while stunned</w:t>
+            </w:r>
+          </w:p>
+        </w:tc>
+      </w:tr>
+      <w:tr>
+        <w:tc>
+          <w:tcPr>
+            <w:tcW w:type="dxa" w:w="1600"/>
+          </w:tcPr>
+          <w:p>
+            <w:r>
+              <w:rPr>
+                <w:rFonts w:ascii="Consolas" w:cs="Consolas" w:eastAsia="Consolas" w:hAnsi="Consolas"/>
+                <w:sz w:val="18"/>
+                <w:szCs w:val="18"/>
+              </w:rPr>
+              <w:t xml:space="preserve">0e70d77</w:t>
+            </w:r>
+          </w:p>
+        </w:tc>
+        <w:tc>
+          <w:tcPr>
+            <w:tcW w:type="dxa" w:w="7000"/>
+          </w:tcPr>
+          <w:p>
+            <w:r>
+              <w:rPr>
+                <w:sz w:val="20"/>
+                <w:szCs w:val="20"/>
+              </w:rPr>
+              <w:t xml:space="preserve">Remove build output and IDE folders from tracking</w:t>
+            </w:r>
+          </w:p>
+        </w:tc>
+      </w:tr>
     </w:tbl>
     <w:p>
       <w:pPr>
@@ -842,7 +918,7 @@
           <w:sz w:val="22"/>
           <w:szCs w:val="22"/>
         </w:rPr>
-        <w:t xml:space="preserve">Timestamps and commit hashes above are taken directly from the project's GitHub commit history. Session content descriptions summarize the technical work discussed and completed collaboratively during each corresponding development session.</w:t>
+        <w:t xml:space="preserve">Timestamps and commit hashes are from the project's GitHub history. The enemy system, include/src restructure, and hitbox fix in Session 3 were done in this session but aren't each tied to a separate commit.</w:t>
       </w:r>
     </w:p>
     <w:sectPr>

</xml_diff>

<commit_message>
Added dev log with up to date info
</commit_message>
<xml_diff>
--- a/Development_Session_Log.docx
+++ b/Development_Session_Log.docx
@@ -885,6 +885,235 @@
                 <w:szCs w:val="20"/>
               </w:rPr>
               <w:t xml:space="preserve">Remove build output and IDE folders from tracking</w:t>
+            </w:r>
+          </w:p>
+        </w:tc>
+      </w:tr>
+    </w:tbl>
+    <w:p>
+      <w:pPr>
+        <w:spacing w:after="160"/>
+      </w:pPr>
+    </w:p>
+    <w:p>
+      <w:pPr>
+        <w:spacing w:after="160"/>
+      </w:pPr>
+    </w:p>
+    <w:p>
+      <w:pPr>
+        <w:pStyle w:val="Heading1"/>
+        <w:pBdr>
+          <w:bottom w:val="single" w:color="CCCCCC" w:sz="6" w:space="6"/>
+        </w:pBdr>
+        <w:spacing w:after="160" w:before="400"/>
+      </w:pPr>
+      <w:r>
+        <w:t xml:space="preserve">Session 4 — September 16, 2026</w:t>
+      </w:r>
+    </w:p>
+    <w:p>
+      <w:pPr>
+        <w:spacing w:after="140"/>
+      </w:pPr>
+      <w:r>
+        <w:rPr>
+          <w:sz w:val="22"/>
+          <w:szCs w:val="22"/>
+        </w:rPr>
+        <w:t xml:space="preserve">Expanded to 3 enemies with a kill counter, and added a death screen.</w:t>
+      </w:r>
+    </w:p>
+    <w:p>
+      <w:pPr>
+        <w:pStyle w:val="ListParagraph"/>
+        <w:numPr>
+          <w:ilvl w:val="0"/>
+          <w:numId w:val="1"/>
+        </w:numPr>
+        <w:spacing w:after="80"/>
+      </w:pPr>
+      <w:r>
+        <w:rPr>
+          <w:sz w:val="22"/>
+          <w:szCs w:val="22"/>
+        </w:rPr>
+        <w:t xml:space="preserve">Added 3 enemies sharing one set of textures, with shared spawn points that avoid overlapping.</w:t>
+      </w:r>
+    </w:p>
+    <w:p>
+      <w:pPr>
+        <w:pStyle w:val="ListParagraph"/>
+        <w:numPr>
+          <w:ilvl w:val="0"/>
+          <w:numId w:val="1"/>
+        </w:numPr>
+        <w:spacing w:after="80"/>
+      </w:pPr>
+      <w:r>
+        <w:rPr>
+          <w:sz w:val="22"/>
+          <w:szCs w:val="22"/>
+        </w:rPr>
+        <w:t xml:space="preserve">Added a kill counter and unlocked the map exit at 7 kills.</w:t>
+      </w:r>
+    </w:p>
+    <w:p>
+      <w:pPr>
+        <w:pStyle w:val="ListParagraph"/>
+        <w:numPr>
+          <w:ilvl w:val="0"/>
+          <w:numId w:val="1"/>
+        </w:numPr>
+        <w:spacing w:after="80"/>
+      </w:pPr>
+      <w:r>
+        <w:rPr>
+          <w:sz w:val="22"/>
+          <w:szCs w:val="22"/>
+        </w:rPr>
+        <w:t xml:space="preserve">Walking past the right edge after unlocking transitions to the second map.</w:t>
+      </w:r>
+    </w:p>
+    <w:p>
+      <w:pPr>
+        <w:pStyle w:val="ListParagraph"/>
+        <w:numPr>
+          <w:ilvl w:val="0"/>
+          <w:numId w:val="1"/>
+        </w:numPr>
+        <w:spacing w:after="80"/>
+      </w:pPr>
+      <w:r>
+        <w:rPr>
+          <w:sz w:val="22"/>
+          <w:szCs w:val="22"/>
+        </w:rPr>
+        <w:t xml:space="preserve">Enemies stop respawning once the kill target is hit on the first map; no limit on the second.</w:t>
+      </w:r>
+    </w:p>
+    <w:p>
+      <w:pPr>
+        <w:pStyle w:val="ListParagraph"/>
+        <w:numPr>
+          <w:ilvl w:val="0"/>
+          <w:numId w:val="1"/>
+        </w:numPr>
+        <w:spacing w:after="80"/>
+      </w:pPr>
+      <w:r>
+        <w:rPr>
+          <w:sz w:val="22"/>
+          <w:szCs w:val="22"/>
+        </w:rPr>
+        <w:t xml:space="preserve">Added a death screen: shows score and time survived, freezes the game.</w:t>
+      </w:r>
+    </w:p>
+    <w:p>
+      <w:pPr>
+        <w:pStyle w:val="ListParagraph"/>
+        <w:numPr>
+          <w:ilvl w:val="0"/>
+          <w:numId w:val="1"/>
+        </w:numPr>
+        <w:spacing w:after="80"/>
+      </w:pPr>
+      <w:r>
+        <w:rPr>
+          <w:sz w:val="22"/>
+          <w:szCs w:val="22"/>
+        </w:rPr>
+        <w:t xml:space="preserve">Kill counter is now always plain white.</w:t>
+      </w:r>
+    </w:p>
+    <w:p>
+      <w:pPr>
+        <w:spacing w:after="80" w:before="160"/>
+      </w:pPr>
+      <w:r>
+        <w:rPr>
+          <w:b/>
+          <w:bCs/>
+          <w:sz w:val="22"/>
+          <w:szCs w:val="22"/>
+        </w:rPr>
+        <w:t xml:space="preserve">Commits this session</w:t>
+      </w:r>
+    </w:p>
+    <w:tbl>
+      <w:tblPr>
+        <w:tblW w:type="dxa" w:w="8600"/>
+        <w:tblBorders>
+          <w:top w:val="single" w:color="auto" w:sz="4"/>
+          <w:left w:val="single" w:color="auto" w:sz="4"/>
+          <w:bottom w:val="single" w:color="auto" w:sz="4"/>
+          <w:right w:val="single" w:color="auto" w:sz="4"/>
+          <w:insideH w:val="single" w:color="auto" w:sz="4"/>
+          <w:insideV w:val="single" w:color="auto" w:sz="4"/>
+        </w:tblBorders>
+      </w:tblPr>
+      <w:tblGrid>
+        <w:gridCol w:w="1600"/>
+        <w:gridCol w:w="7000"/>
+      </w:tblGrid>
+      <w:tr>
+        <w:tc>
+          <w:tcPr>
+            <w:tcW w:type="dxa" w:w="1600"/>
+          </w:tcPr>
+          <w:p>
+            <w:r>
+              <w:rPr>
+                <w:rFonts w:ascii="Consolas" w:cs="Consolas" w:eastAsia="Consolas" w:hAnsi="Consolas"/>
+                <w:sz w:val="18"/>
+                <w:szCs w:val="18"/>
+              </w:rPr>
+              <w:t xml:space="preserve">e2f3327</w:t>
+            </w:r>
+          </w:p>
+        </w:tc>
+        <w:tc>
+          <w:tcPr>
+            <w:tcW w:type="dxa" w:w="7000"/>
+          </w:tcPr>
+          <w:p>
+            <w:r>
+              <w:rPr>
+                <w:sz w:val="20"/>
+                <w:szCs w:val="20"/>
+              </w:rPr>
+              <w:t xml:space="preserve">Add 3 enemies, kill counter, and map transition on exit</w:t>
+            </w:r>
+          </w:p>
+        </w:tc>
+      </w:tr>
+      <w:tr>
+        <w:tc>
+          <w:tcPr>
+            <w:tcW w:type="dxa" w:w="1600"/>
+          </w:tcPr>
+          <w:p>
+            <w:r>
+              <w:rPr>
+                <w:rFonts w:ascii="Consolas" w:cs="Consolas" w:eastAsia="Consolas" w:hAnsi="Consolas"/>
+                <w:sz w:val="18"/>
+                <w:szCs w:val="18"/>
+              </w:rPr>
+              <w:t xml:space="preserve">1ee04d9</w:t>
+            </w:r>
+          </w:p>
+        </w:tc>
+        <w:tc>
+          <w:tcPr>
+            <w:tcW w:type="dxa" w:w="7000"/>
+          </w:tcPr>
+          <w:p>
+            <w:r>
+              <w:rPr>
+                <w:sz w:val="20"/>
+                <w:szCs w:val="20"/>
+              </w:rPr>
+              <w:t xml:space="preserve">Add death screen, cap enemy spawns at kill limit</w:t>
             </w:r>
           </w:p>
         </w:tc>

</xml_diff>